<commit_message>
test: regenerate baselines for the 8.1.0 review fixes
The configs snapshot every parser option; DOCX keeps its line breaks and
tabs (a table of contents' page numbers), RTF reads a nested table nested,
ODS keeps a cell's line break and spans, pictures without alt text are
written without one, LaTeX writes alt text as graphicx's alt key, and DOCX,
ODT and EPUB write bookmarks for every anchored node. No text a baseline
held is lost.
</commit_message>
<xml_diff>
--- a/test/generator/baseline/gen.docx.to.docx.docx
+++ b/test/generator/baseline/gen.docx.to.docx.docx
@@ -119,6 +119,9 @@
     <w:p>
       <w:r>
         <w:t xml:space="preserve">Here, we demonstrate various types of inline text formatting and the use of embedded fonts.</w:t>
+      </w:r>
+      <w:r>
+        <w:br/>
       </w:r>
     </w:p>
     <w:p>
@@ -2967,16 +2970,10 @@
           <w:rPr>
             <w:rStyle w:val="Hyperlink"/>
             <w:b/>
-            <w:color w:val="0000FF"/>
-            <w:sz w:val="20"/>
-            <w:u w:val="single"/>
-          </w:rPr>
-          <w:t xml:space="preserve">1</w:t>
-        </w:r>
-      </w:hyperlink>
-    </w:p>
-    <w:p>
-      <w:hyperlink w:anchor="_Toc2054249818">
+            <w:sz w:val="20"/>
+          </w:rPr>
+          <w:tab/>
+        </w:r>
         <w:r>
           <w:rPr>
             <w:rStyle w:val="Hyperlink"/>
@@ -2985,8 +2982,12 @@
             <w:sz w:val="20"/>
             <w:u w:val="single"/>
           </w:rPr>
-          <w:t xml:space="preserve">Text Formatting</w:t>
-        </w:r>
+          <w:t xml:space="preserve">1</w:t>
+        </w:r>
+      </w:hyperlink>
+    </w:p>
+    <w:p>
+      <w:hyperlink w:anchor="_Toc2054249818">
         <w:r>
           <w:rPr>
             <w:rStyle w:val="Hyperlink"/>
@@ -2995,6 +2996,24 @@
             <w:sz w:val="20"/>
             <w:u w:val="single"/>
           </w:rPr>
+          <w:t xml:space="preserve">Text Formatting</w:t>
+        </w:r>
+        <w:r>
+          <w:rPr>
+            <w:rStyle w:val="Hyperlink"/>
+            <w:b/>
+            <w:sz w:val="20"/>
+          </w:rPr>
+          <w:tab/>
+        </w:r>
+        <w:r>
+          <w:rPr>
+            <w:rStyle w:val="Hyperlink"/>
+            <w:b/>
+            <w:color w:val="0000FF"/>
+            <w:sz w:val="20"/>
+            <w:u w:val="single"/>
+          </w:rPr>
           <w:t xml:space="preserve">1</w:t>
         </w:r>
       </w:hyperlink>
@@ -3018,19 +3037,10 @@
           <w:rPr>
             <w:rStyle w:val="Hyperlink"/>
             <w:i/>
-            <w:color w:val="0000FF"/>
-            <w:sz w:val="20"/>
-            <w:u w:val="single"/>
-          </w:rPr>
-          <w:t xml:space="preserve">2</w:t>
-        </w:r>
-      </w:hyperlink>
-    </w:p>
-    <w:p>
-      <w:pPr>
-        <w:ind w:left="240"/>
-      </w:pPr>
-      <w:hyperlink w:anchor="_Toc1074133965">
+            <w:sz w:val="20"/>
+          </w:rPr>
+          <w:tab/>
+        </w:r>
         <w:r>
           <w:rPr>
             <w:rStyle w:val="Hyperlink"/>
@@ -3039,8 +3049,15 @@
             <w:sz w:val="20"/>
             <w:u w:val="single"/>
           </w:rPr>
-          <w:t xml:space="preserve">Fun with fonts</w:t>
-        </w:r>
+          <w:t xml:space="preserve">2</w:t>
+        </w:r>
+      </w:hyperlink>
+    </w:p>
+    <w:p>
+      <w:pPr>
+        <w:ind w:left="240"/>
+      </w:pPr>
+      <w:hyperlink w:anchor="_Toc1074133965">
         <w:r>
           <w:rPr>
             <w:rStyle w:val="Hyperlink"/>
@@ -3049,15 +3066,16 @@
             <w:sz w:val="20"/>
             <w:u w:val="single"/>
           </w:rPr>
-          <w:t xml:space="preserve">2</w:t>
-        </w:r>
-      </w:hyperlink>
-    </w:p>
-    <w:p>
-      <w:pPr>
-        <w:ind w:left="240"/>
-      </w:pPr>
-      <w:hyperlink w:anchor="_Toc2022725662">
+          <w:t xml:space="preserve">Fun with fonts</w:t>
+        </w:r>
+        <w:r>
+          <w:rPr>
+            <w:rStyle w:val="Hyperlink"/>
+            <w:i/>
+            <w:sz w:val="20"/>
+          </w:rPr>
+          <w:tab/>
+        </w:r>
         <w:r>
           <w:rPr>
             <w:rStyle w:val="Hyperlink"/>
@@ -3066,8 +3084,15 @@
             <w:sz w:val="20"/>
             <w:u w:val="single"/>
           </w:rPr>
-          <w:t xml:space="preserve">Paragraph level formatting</w:t>
-        </w:r>
+          <w:t xml:space="preserve">2</w:t>
+        </w:r>
+      </w:hyperlink>
+    </w:p>
+    <w:p>
+      <w:pPr>
+        <w:ind w:left="240"/>
+      </w:pPr>
+      <w:hyperlink w:anchor="_Toc2022725662">
         <w:r>
           <w:rPr>
             <w:rStyle w:val="Hyperlink"/>
@@ -3076,6 +3101,24 @@
             <w:sz w:val="20"/>
             <w:u w:val="single"/>
           </w:rPr>
+          <w:t xml:space="preserve">Paragraph level formatting</w:t>
+        </w:r>
+        <w:r>
+          <w:rPr>
+            <w:rStyle w:val="Hyperlink"/>
+            <w:i/>
+            <w:sz w:val="20"/>
+          </w:rPr>
+          <w:tab/>
+        </w:r>
+        <w:r>
+          <w:rPr>
+            <w:rStyle w:val="Hyperlink"/>
+            <w:i/>
+            <w:color w:val="0000FF"/>
+            <w:sz w:val="20"/>
+            <w:u w:val="single"/>
+          </w:rPr>
           <w:t xml:space="preserve">2</w:t>
         </w:r>
       </w:hyperlink>
@@ -3096,16 +3139,10 @@
           <w:rPr>
             <w:rStyle w:val="Hyperlink"/>
             <w:b/>
-            <w:color w:val="0000FF"/>
-            <w:sz w:val="20"/>
-            <w:u w:val="single"/>
-          </w:rPr>
-          <w:t xml:space="preserve">2</w:t>
-        </w:r>
-      </w:hyperlink>
-    </w:p>
-    <w:p>
-      <w:hyperlink w:anchor="_Toc54889875">
+            <w:sz w:val="20"/>
+          </w:rPr>
+          <w:tab/>
+        </w:r>
         <w:r>
           <w:rPr>
             <w:rStyle w:val="Hyperlink"/>
@@ -3114,8 +3151,12 @@
             <w:sz w:val="20"/>
             <w:u w:val="single"/>
           </w:rPr>
-          <w:t xml:space="preserve">Structural Elements</w:t>
-        </w:r>
+          <w:t xml:space="preserve">2</w:t>
+        </w:r>
+      </w:hyperlink>
+    </w:p>
+    <w:p>
+      <w:hyperlink w:anchor="_Toc54889875">
         <w:r>
           <w:rPr>
             <w:rStyle w:val="Hyperlink"/>
@@ -3124,6 +3165,24 @@
             <w:sz w:val="20"/>
             <w:u w:val="single"/>
           </w:rPr>
+          <w:t xml:space="preserve">Structural Elements</w:t>
+        </w:r>
+        <w:r>
+          <w:rPr>
+            <w:rStyle w:val="Hyperlink"/>
+            <w:b/>
+            <w:sz w:val="20"/>
+          </w:rPr>
+          <w:tab/>
+        </w:r>
+        <w:r>
+          <w:rPr>
+            <w:rStyle w:val="Hyperlink"/>
+            <w:b/>
+            <w:color w:val="0000FF"/>
+            <w:sz w:val="20"/>
+            <w:u w:val="single"/>
+          </w:rPr>
           <w:t xml:space="preserve">4</w:t>
         </w:r>
       </w:hyperlink>
@@ -3147,19 +3206,10 @@
           <w:rPr>
             <w:rStyle w:val="Hyperlink"/>
             <w:i/>
-            <w:color w:val="0000FF"/>
-            <w:sz w:val="20"/>
-            <w:u w:val="single"/>
-          </w:rPr>
-          <w:t xml:space="preserve">5</w:t>
-        </w:r>
-      </w:hyperlink>
-    </w:p>
-    <w:p>
-      <w:pPr>
-        <w:ind w:left="240"/>
-      </w:pPr>
-      <w:hyperlink w:anchor="_Toc1977424358">
+            <w:sz w:val="20"/>
+          </w:rPr>
+          <w:tab/>
+        </w:r>
         <w:r>
           <w:rPr>
             <w:rStyle w:val="Hyperlink"/>
@@ -3168,8 +3218,15 @@
             <w:sz w:val="20"/>
             <w:u w:val="single"/>
           </w:rPr>
-          <w:t xml:space="preserve">Dropcaps</w:t>
-        </w:r>
+          <w:t xml:space="preserve">5</w:t>
+        </w:r>
+      </w:hyperlink>
+    </w:p>
+    <w:p>
+      <w:pPr>
+        <w:ind w:left="240"/>
+      </w:pPr>
+      <w:hyperlink w:anchor="_Toc1977424358">
         <w:r>
           <w:rPr>
             <w:rStyle w:val="Hyperlink"/>
@@ -3178,15 +3235,16 @@
             <w:sz w:val="20"/>
             <w:u w:val="single"/>
           </w:rPr>
-          <w:t xml:space="preserve">5</w:t>
-        </w:r>
-      </w:hyperlink>
-    </w:p>
-    <w:p>
-      <w:pPr>
-        <w:ind w:left="240"/>
-      </w:pPr>
-      <w:hyperlink w:anchor="_Toc1233048813">
+          <w:t xml:space="preserve">Dropcaps</w:t>
+        </w:r>
+        <w:r>
+          <w:rPr>
+            <w:rStyle w:val="Hyperlink"/>
+            <w:i/>
+            <w:sz w:val="20"/>
+          </w:rPr>
+          <w:tab/>
+        </w:r>
         <w:r>
           <w:rPr>
             <w:rStyle w:val="Hyperlink"/>
@@ -3195,8 +3253,15 @@
             <w:sz w:val="20"/>
             <w:u w:val="single"/>
           </w:rPr>
-          <w:t xml:space="preserve">Links</w:t>
-        </w:r>
+          <w:t xml:space="preserve">5</w:t>
+        </w:r>
+      </w:hyperlink>
+    </w:p>
+    <w:p>
+      <w:pPr>
+        <w:ind w:left="240"/>
+      </w:pPr>
+      <w:hyperlink w:anchor="_Toc1233048813">
         <w:r>
           <w:rPr>
             <w:rStyle w:val="Hyperlink"/>
@@ -3205,15 +3270,16 @@
             <w:sz w:val="20"/>
             <w:u w:val="single"/>
           </w:rPr>
-          <w:t xml:space="preserve">5</w:t>
-        </w:r>
-      </w:hyperlink>
-    </w:p>
-    <w:p>
-      <w:pPr>
-        <w:ind w:left="240"/>
-      </w:pPr>
-      <w:hyperlink w:anchor="_Toc64145348">
+          <w:t xml:space="preserve">Links</w:t>
+        </w:r>
+        <w:r>
+          <w:rPr>
+            <w:rStyle w:val="Hyperlink"/>
+            <w:i/>
+            <w:sz w:val="20"/>
+          </w:rPr>
+          <w:tab/>
+        </w:r>
         <w:r>
           <w:rPr>
             <w:rStyle w:val="Hyperlink"/>
@@ -3222,8 +3288,15 @@
             <w:sz w:val="20"/>
             <w:u w:val="single"/>
           </w:rPr>
-          <w:t xml:space="preserve">Table of Contents</w:t>
-        </w:r>
+          <w:t xml:space="preserve">5</w:t>
+        </w:r>
+      </w:hyperlink>
+    </w:p>
+    <w:p>
+      <w:pPr>
+        <w:ind w:left="240"/>
+      </w:pPr>
+      <w:hyperlink w:anchor="_Toc64145348">
         <w:r>
           <w:rPr>
             <w:rStyle w:val="Hyperlink"/>
@@ -3232,6 +3305,24 @@
             <w:sz w:val="20"/>
             <w:u w:val="single"/>
           </w:rPr>
+          <w:t xml:space="preserve">Table of Contents</w:t>
+        </w:r>
+        <w:r>
+          <w:rPr>
+            <w:rStyle w:val="Hyperlink"/>
+            <w:i/>
+            <w:sz w:val="20"/>
+          </w:rPr>
+          <w:tab/>
+        </w:r>
+        <w:r>
+          <w:rPr>
+            <w:rStyle w:val="Hyperlink"/>
+            <w:i/>
+            <w:color w:val="0000FF"/>
+            <w:sz w:val="20"/>
+            <w:u w:val="single"/>
+          </w:rPr>
           <w:t xml:space="preserve">5</w:t>
         </w:r>
       </w:hyperlink>
@@ -3252,16 +3343,10 @@
           <w:rPr>
             <w:rStyle w:val="Hyperlink"/>
             <w:b/>
-            <w:color w:val="0000FF"/>
-            <w:sz w:val="20"/>
-            <w:u w:val="single"/>
-          </w:rPr>
-          <w:t xml:space="preserve">6</w:t>
-        </w:r>
-      </w:hyperlink>
-    </w:p>
-    <w:p>
-      <w:hyperlink w:anchor="_Toc1359965655">
+            <w:sz w:val="20"/>
+          </w:rPr>
+          <w:tab/>
+        </w:r>
         <w:r>
           <w:rPr>
             <w:rStyle w:val="Hyperlink"/>
@@ -3270,8 +3355,12 @@
             <w:sz w:val="20"/>
             <w:u w:val="single"/>
           </w:rPr>
-          <w:t xml:space="preserve">Lists</w:t>
-        </w:r>
+          <w:t xml:space="preserve">6</w:t>
+        </w:r>
+      </w:hyperlink>
+    </w:p>
+    <w:p>
+      <w:hyperlink w:anchor="_Toc1359965655">
         <w:r>
           <w:rPr>
             <w:rStyle w:val="Hyperlink"/>
@@ -3280,6 +3369,24 @@
             <w:sz w:val="20"/>
             <w:u w:val="single"/>
           </w:rPr>
+          <w:t xml:space="preserve">Lists</w:t>
+        </w:r>
+        <w:r>
+          <w:rPr>
+            <w:rStyle w:val="Hyperlink"/>
+            <w:b/>
+            <w:sz w:val="20"/>
+          </w:rPr>
+          <w:tab/>
+        </w:r>
+        <w:r>
+          <w:rPr>
+            <w:rStyle w:val="Hyperlink"/>
+            <w:b/>
+            <w:color w:val="0000FF"/>
+            <w:sz w:val="20"/>
+            <w:u w:val="single"/>
+          </w:rPr>
           <w:t xml:space="preserve">7</w:t>
         </w:r>
       </w:hyperlink>
@@ -3303,19 +3410,10 @@
           <w:rPr>
             <w:rStyle w:val="Hyperlink"/>
             <w:i/>
-            <w:color w:val="0000FF"/>
-            <w:sz w:val="20"/>
-            <w:u w:val="single"/>
-          </w:rPr>
-          <w:t xml:space="preserve">8</w:t>
-        </w:r>
-      </w:hyperlink>
-    </w:p>
-    <w:p>
-      <w:pPr>
-        <w:ind w:left="240"/>
-      </w:pPr>
-      <w:hyperlink w:anchor="_Toc415190676">
+            <w:sz w:val="20"/>
+          </w:rPr>
+          <w:tab/>
+        </w:r>
         <w:r>
           <w:rPr>
             <w:rStyle w:val="Hyperlink"/>
@@ -3324,8 +3422,15 @@
             <w:sz w:val="20"/>
             <w:u w:val="single"/>
           </w:rPr>
-          <w:t xml:space="preserve">Numbered List</w:t>
-        </w:r>
+          <w:t xml:space="preserve">8</w:t>
+        </w:r>
+      </w:hyperlink>
+    </w:p>
+    <w:p>
+      <w:pPr>
+        <w:ind w:left="240"/>
+      </w:pPr>
+      <w:hyperlink w:anchor="_Toc415190676">
         <w:r>
           <w:rPr>
             <w:rStyle w:val="Hyperlink"/>
@@ -3334,15 +3439,16 @@
             <w:sz w:val="20"/>
             <w:u w:val="single"/>
           </w:rPr>
-          <w:t xml:space="preserve">8</w:t>
-        </w:r>
-      </w:hyperlink>
-    </w:p>
-    <w:p>
-      <w:pPr>
-        <w:ind w:left="240"/>
-      </w:pPr>
-      <w:hyperlink w:anchor="_Toc1093260318">
+          <w:t xml:space="preserve">Numbered List</w:t>
+        </w:r>
+        <w:r>
+          <w:rPr>
+            <w:rStyle w:val="Hyperlink"/>
+            <w:i/>
+            <w:sz w:val="20"/>
+          </w:rPr>
+          <w:tab/>
+        </w:r>
         <w:r>
           <w:rPr>
             <w:rStyle w:val="Hyperlink"/>
@@ -3351,8 +3457,15 @@
             <w:sz w:val="20"/>
             <w:u w:val="single"/>
           </w:rPr>
-          <w:t xml:space="preserve">Multi-level Lists</w:t>
-        </w:r>
+          <w:t xml:space="preserve">8</w:t>
+        </w:r>
+      </w:hyperlink>
+    </w:p>
+    <w:p>
+      <w:pPr>
+        <w:ind w:left="240"/>
+      </w:pPr>
+      <w:hyperlink w:anchor="_Toc1093260318">
         <w:r>
           <w:rPr>
             <w:rStyle w:val="Hyperlink"/>
@@ -3361,15 +3474,16 @@
             <w:sz w:val="20"/>
             <w:u w:val="single"/>
           </w:rPr>
-          <w:t xml:space="preserve">8</w:t>
-        </w:r>
-      </w:hyperlink>
-    </w:p>
-    <w:p>
-      <w:pPr>
-        <w:ind w:left="240"/>
-      </w:pPr>
-      <w:hyperlink w:anchor="_Toc1471533984">
+          <w:t xml:space="preserve">Multi-level Lists</w:t>
+        </w:r>
+        <w:r>
+          <w:rPr>
+            <w:rStyle w:val="Hyperlink"/>
+            <w:i/>
+            <w:sz w:val="20"/>
+          </w:rPr>
+          <w:tab/>
+        </w:r>
         <w:r>
           <w:rPr>
             <w:rStyle w:val="Hyperlink"/>
@@ -3378,7 +3492,32 @@
             <w:sz w:val="20"/>
             <w:u w:val="single"/>
           </w:rPr>
+          <w:t xml:space="preserve">8</w:t>
+        </w:r>
+      </w:hyperlink>
+    </w:p>
+    <w:p>
+      <w:pPr>
+        <w:ind w:left="240"/>
+      </w:pPr>
+      <w:hyperlink w:anchor="_Toc1471533984">
+        <w:r>
+          <w:rPr>
+            <w:rStyle w:val="Hyperlink"/>
+            <w:i/>
+            <w:color w:val="0000FF"/>
+            <w:sz w:val="20"/>
+            <w:u w:val="single"/>
+          </w:rPr>
           <w:t xml:space="preserve">Continued Lists</w:t>
+        </w:r>
+        <w:r>
+          <w:rPr>
+            <w:rStyle w:val="Hyperlink"/>
+            <w:i/>
+            <w:sz w:val="20"/>
+          </w:rPr>
+          <w:tab/>
         </w:r>
         <w:r>
           <w:rPr>

</xml_diff>

<commit_message>
feat: paragraph spacing is read, written and printed
ParagraphMetadata and HeadingMetadata carry spacing (space before and
after in points, line spacing as a multiple or a fixed or least height),
read from Word's w:spacing, ODF's margins and line height, RTF's \sb \sa
\sl \slmult and an HTML element's margins and line-height. DOCX, ODT,
RTF and HTML output write it, and the native PDF engine sets it: double
spaced text printed single.
</commit_message>
<xml_diff>
--- a/test/generator/baseline/gen.docx.to.docx.docx
+++ b/test/generator/baseline/gen.docx.to.docx.docx
@@ -5,6 +5,7 @@
     <w:p>
       <w:pPr>
         <w:pStyle w:val="Heading1"/>
+        <w:spacing w:after="300"/>
       </w:pPr>
       <w:bookmarkStart w:id="0" w:name="OLE_LINK1"/>
       <w:bookmarkStart w:id="1" w:name="OLE_LINK2"/>
@@ -84,6 +85,7 @@
     <w:p>
       <w:pPr>
         <w:pStyle w:val="Heading1"/>
+        <w:spacing w:before="480"/>
         <w:jc w:val="center"/>
       </w:pPr>
       <w:bookmarkStart w:id="4" w:name="_Toc2054249818"/>
@@ -102,6 +104,7 @@
     <w:p>
       <w:pPr>
         <w:pStyle w:val="Heading2"/>
+        <w:spacing w:before="200"/>
       </w:pPr>
       <w:bookmarkStart w:id="6" w:name="_Toc2137712100"/>
       <w:bookmarkStart w:id="7" w:name="inline_formatting"/>
@@ -302,6 +305,7 @@
     <w:p>
       <w:pPr>
         <w:pStyle w:val="Heading2"/>
+        <w:spacing w:before="200"/>
       </w:pPr>
       <w:bookmarkStart w:id="8" w:name="_Toc1074133965"/>
       <w:bookmarkStart w:id="9" w:name="fun_with_fonts"/>
@@ -342,6 +346,7 @@
     <w:p>
       <w:pPr>
         <w:pStyle w:val="Heading2"/>
+        <w:spacing w:before="200"/>
       </w:pPr>
       <w:bookmarkStart w:id="10" w:name="_Paragraph_level_formatting"/>
       <w:bookmarkStart w:id="11" w:name="_Toc2022725662"/>
@@ -371,6 +376,7 @@
     </w:p>
     <w:p>
       <w:pPr>
+        <w:spacing w:before="600"/>
         <w:ind w:left="720" w:hanging="720"/>
       </w:pPr>
       <w:r>
@@ -380,6 +386,7 @@
     <w:p>
       <w:pPr>
         <w:pStyle w:val="Heading1"/>
+        <w:spacing w:before="480"/>
         <w:jc w:val="center"/>
       </w:pPr>
       <w:bookmarkStart w:id="13" w:name="_Toc28114276"/>
@@ -1041,6 +1048,9 @@
     </w:tbl>
     <w:p/>
     <w:p>
+      <w:pPr>
+        <w:spacing w:before="240" w:after="240"/>
+      </w:pPr>
       <w:r>
         <w:t xml:space="preserve">Next, we see a table with special formatting in various locations. Notice how the f</w:t>
       </w:r>
@@ -1162,6 +1172,9 @@
             <w:tcW w:w="0" w:type="auto"/>
           </w:tcPr>
           <w:p>
+            <w:pPr>
+              <w:spacing w:after="200"/>
+            </w:pPr>
             <w:r>
               <w:rPr>
                 <w:sz w:val="22"/>
@@ -1175,6 +1188,9 @@
             <w:tcW w:w="0" w:type="auto"/>
           </w:tcPr>
           <w:p>
+            <w:pPr>
+              <w:spacing w:after="200"/>
+            </w:pPr>
             <w:r>
               <w:rPr>
                 <w:sz w:val="22"/>
@@ -1188,6 +1204,9 @@
             <w:tcW w:w="0" w:type="auto"/>
           </w:tcPr>
           <w:p>
+            <w:pPr>
+              <w:spacing w:after="200"/>
+            </w:pPr>
             <w:r>
               <w:rPr>
                 <w:sz w:val="22"/>
@@ -1213,6 +1232,9 @@
             <w:tcW w:w="0" w:type="auto"/>
           </w:tcPr>
           <w:p>
+            <w:pPr>
+              <w:spacing w:after="200"/>
+            </w:pPr>
             <w:r>
               <w:rPr>
                 <w:sz w:val="22"/>
@@ -1226,6 +1248,9 @@
             <w:tcW w:w="0" w:type="auto"/>
           </w:tcPr>
           <w:p>
+            <w:pPr>
+              <w:spacing w:after="200"/>
+            </w:pPr>
             <w:r>
               <w:rPr>
                 <w:sz w:val="22"/>
@@ -1239,6 +1264,9 @@
             <w:tcW w:w="0" w:type="auto"/>
           </w:tcPr>
           <w:p>
+            <w:pPr>
+              <w:spacing w:after="200"/>
+            </w:pPr>
             <w:r>
               <w:rPr>
                 <w:sz w:val="22"/>
@@ -1298,6 +1326,9 @@
             <w:tcW w:w="0" w:type="auto"/>
           </w:tcPr>
           <w:p>
+            <w:pPr>
+              <w:spacing w:after="200"/>
+            </w:pPr>
             <w:r>
               <w:rPr>
                 <w:sz w:val="22"/>
@@ -1311,6 +1342,9 @@
             <w:tcW w:w="0" w:type="auto"/>
           </w:tcPr>
           <w:p>
+            <w:pPr>
+              <w:spacing w:after="200"/>
+            </w:pPr>
             <w:r>
               <w:rPr>
                 <w:sz w:val="22"/>
@@ -1324,6 +1358,9 @@
             <w:tcW w:w="0" w:type="auto"/>
           </w:tcPr>
           <w:p>
+            <w:pPr>
+              <w:spacing w:after="200"/>
+            </w:pPr>
             <w:r>
               <w:rPr>
                 <w:sz w:val="22"/>
@@ -1349,6 +1386,9 @@
             <w:tcW w:w="0" w:type="auto"/>
           </w:tcPr>
           <w:p>
+            <w:pPr>
+              <w:spacing w:after="200"/>
+            </w:pPr>
             <w:r>
               <w:rPr>
                 <w:sz w:val="22"/>
@@ -1362,6 +1402,9 @@
             <w:tcW w:w="0" w:type="auto"/>
           </w:tcPr>
           <w:p>
+            <w:pPr>
+              <w:spacing w:after="200"/>
+            </w:pPr>
             <w:r>
               <w:rPr>
                 <w:sz w:val="22"/>
@@ -1375,6 +1418,9 @@
             <w:tcW w:w="0" w:type="auto"/>
           </w:tcPr>
           <w:p>
+            <w:pPr>
+              <w:spacing w:after="200"/>
+            </w:pPr>
             <w:r>
               <w:rPr>
                 <w:sz w:val="22"/>
@@ -1400,6 +1446,9 @@
             <w:tcW w:w="0" w:type="auto"/>
           </w:tcPr>
           <w:p>
+            <w:pPr>
+              <w:spacing w:after="200"/>
+            </w:pPr>
             <w:r>
               <w:rPr>
                 <w:sz w:val="22"/>
@@ -1413,6 +1462,9 @@
             <w:tcW w:w="0" w:type="auto"/>
           </w:tcPr>
           <w:p>
+            <w:pPr>
+              <w:spacing w:after="200"/>
+            </w:pPr>
             <w:r>
               <w:rPr>
                 <w:sz w:val="22"/>
@@ -1426,6 +1478,9 @@
             <w:tcW w:w="0" w:type="auto"/>
           </w:tcPr>
           <w:p>
+            <w:pPr>
+              <w:spacing w:after="200"/>
+            </w:pPr>
             <w:r>
               <w:rPr>
                 <w:sz w:val="22"/>
@@ -1453,6 +1508,9 @@
       </w:r>
     </w:p>
     <w:p>
+      <w:pPr>
+        <w:spacing w:before="240"/>
+      </w:pPr>
       <w:r>
         <w:t xml:space="preserve">Next</w:t>
       </w:r>
@@ -1509,11 +1567,17 @@
                   <w:vMerge w:val="restart"/>
                 </w:tcPr>
                 <w:p>
+                  <w:pPr>
+                    <w:spacing w:before="240"/>
+                  </w:pPr>
                   <w:r>
                     <w:t xml:space="preserve">One</w:t>
                   </w:r>
                 </w:p>
                 <w:p>
+                  <w:pPr>
+                    <w:spacing w:before="240"/>
+                  </w:pPr>
                   <w:r>
                     <w:t xml:space="preserve">Three</w:t>
                   </w:r>
@@ -1524,6 +1588,9 @@
                   <w:tcW w:w="0" w:type="auto"/>
                 </w:tcPr>
                 <w:p>
+                  <w:pPr>
+                    <w:spacing w:before="240"/>
+                  </w:pPr>
                   <w:r>
                     <w:t xml:space="preserve">Two</w:t>
                   </w:r>
@@ -1543,6 +1610,9 @@
                   <w:tcW w:w="0" w:type="auto"/>
                 </w:tcPr>
                 <w:p>
+                  <w:pPr>
+                    <w:spacing w:before="240"/>
+                  </w:pPr>
                   <w:r>
                     <w:t xml:space="preserve">Four</w:t>
                   </w:r>
@@ -1550,13 +1620,20 @@
               </w:tc>
             </w:tr>
           </w:tbl>
-          <w:p/>
-        </w:tc>
-        <w:tc>
-          <w:tcPr>
-            <w:tcW w:w="0" w:type="auto"/>
-          </w:tcPr>
-          <w:p>
+          <w:p>
+            <w:pPr>
+              <w:spacing w:before="240"/>
+            </w:pPr>
+          </w:p>
+        </w:tc>
+        <w:tc>
+          <w:tcPr>
+            <w:tcW w:w="0" w:type="auto"/>
+          </w:tcPr>
+          <w:p>
+            <w:pPr>
+              <w:spacing w:before="240"/>
+            </w:pPr>
             <w:r>
               <w:t xml:space="preserve">To the left is a table inside a table, with some cells merged.</w:t>
             </w:r>
@@ -1564,8 +1641,15 @@
         </w:tc>
       </w:tr>
     </w:tbl>
-    <w:p/>
-    <w:p>
+    <w:p>
+      <w:pPr>
+        <w:spacing w:before="240"/>
+      </w:pPr>
+    </w:p>
+    <w:p>
+      <w:pPr>
+        <w:spacing w:before="240"/>
+      </w:pPr>
       <w:r>
         <w:t xml:space="preserve">W</w:t>
       </w:r>
@@ -2758,6 +2842,7 @@
     <w:p>
       <w:pPr>
         <w:pStyle w:val="Heading1"/>
+        <w:spacing w:before="480"/>
         <w:jc w:val="center"/>
       </w:pPr>
       <w:bookmarkStart w:id="15" w:name="_Toc54889875"/>
@@ -2781,6 +2866,7 @@
     <w:p>
       <w:pPr>
         <w:pStyle w:val="Heading2"/>
+        <w:spacing w:before="200"/>
       </w:pPr>
       <w:bookmarkStart w:id="17" w:name="_Toc201580556"/>
       <w:bookmarkStart w:id="18" w:name="footnotes_endnotes"/>
@@ -2821,6 +2907,7 @@
     <w:p>
       <w:pPr>
         <w:pStyle w:val="Heading2"/>
+        <w:spacing w:before="200"/>
       </w:pPr>
       <w:bookmarkStart w:id="19" w:name="_Toc1977424358"/>
       <w:bookmarkStart w:id="20" w:name="dropcaps"/>
@@ -2836,6 +2923,9 @@
       <w:bookmarkEnd w:id="20"/>
     </w:p>
     <w:p>
+      <w:pPr>
+        <w:spacing w:line="951" w:lineRule="exact"/>
+      </w:pPr>
       <w:r>
         <w:rPr>
           <w:sz w:val="117"/>
@@ -2866,6 +2956,7 @@
     <w:p>
       <w:pPr>
         <w:pStyle w:val="Heading2"/>
+        <w:spacing w:before="200"/>
       </w:pPr>
       <w:bookmarkStart w:id="21" w:name="_Toc1233048813"/>
       <w:bookmarkStart w:id="22" w:name="links"/>
@@ -2923,6 +3014,7 @@
     <w:p>
       <w:pPr>
         <w:pStyle w:val="Heading2"/>
+        <w:spacing w:before="200"/>
       </w:pPr>
       <w:bookmarkStart w:id="23" w:name="_Toc64145348"/>
       <w:bookmarkStart w:id="24" w:name="table_of_contents"/>
@@ -2955,6 +3047,9 @@
       </w:r>
     </w:p>
     <w:p>
+      <w:pPr>
+        <w:spacing w:before="240" w:after="120"/>
+      </w:pPr>
       <w:hyperlink w:anchor="_Toc581531977">
         <w:r>
           <w:rPr>
@@ -2987,6 +3082,9 @@
       </w:hyperlink>
     </w:p>
     <w:p>
+      <w:pPr>
+        <w:spacing w:before="240" w:after="120"/>
+      </w:pPr>
       <w:hyperlink w:anchor="_Toc2054249818">
         <w:r>
           <w:rPr>
@@ -3020,6 +3118,7 @@
     </w:p>
     <w:p>
       <w:pPr>
+        <w:spacing w:before="120"/>
         <w:ind w:left="240"/>
       </w:pPr>
       <w:hyperlink w:anchor="_Toc2137712100">
@@ -3055,6 +3154,7 @@
     </w:p>
     <w:p>
       <w:pPr>
+        <w:spacing w:before="120"/>
         <w:ind w:left="240"/>
       </w:pPr>
       <w:hyperlink w:anchor="_Toc1074133965">
@@ -3090,6 +3190,7 @@
     </w:p>
     <w:p>
       <w:pPr>
+        <w:spacing w:before="120"/>
         <w:ind w:left="240"/>
       </w:pPr>
       <w:hyperlink w:anchor="_Toc2022725662">
@@ -3124,6 +3225,9 @@
       </w:hyperlink>
     </w:p>
     <w:p>
+      <w:pPr>
+        <w:spacing w:before="240" w:after="120"/>
+      </w:pPr>
       <w:hyperlink w:anchor="_Toc28114276">
         <w:r>
           <w:rPr>
@@ -3156,6 +3260,9 @@
       </w:hyperlink>
     </w:p>
     <w:p>
+      <w:pPr>
+        <w:spacing w:before="240" w:after="120"/>
+      </w:pPr>
       <w:hyperlink w:anchor="_Toc54889875">
         <w:r>
           <w:rPr>
@@ -3189,6 +3296,7 @@
     </w:p>
     <w:p>
       <w:pPr>
+        <w:spacing w:before="120"/>
         <w:ind w:left="240"/>
       </w:pPr>
       <w:hyperlink w:anchor="_Toc201580556">
@@ -3224,6 +3332,7 @@
     </w:p>
     <w:p>
       <w:pPr>
+        <w:spacing w:before="120"/>
         <w:ind w:left="240"/>
       </w:pPr>
       <w:hyperlink w:anchor="_Toc1977424358">
@@ -3259,6 +3368,7 @@
     </w:p>
     <w:p>
       <w:pPr>
+        <w:spacing w:before="120"/>
         <w:ind w:left="240"/>
       </w:pPr>
       <w:hyperlink w:anchor="_Toc1233048813">
@@ -3294,6 +3404,7 @@
     </w:p>
     <w:p>
       <w:pPr>
+        <w:spacing w:before="120"/>
         <w:ind w:left="240"/>
       </w:pPr>
       <w:hyperlink w:anchor="_Toc64145348">
@@ -3328,6 +3439,9 @@
       </w:hyperlink>
     </w:p>
     <w:p>
+      <w:pPr>
+        <w:spacing w:before="240" w:after="120"/>
+      </w:pPr>
       <w:hyperlink w:anchor="_Toc484565143">
         <w:r>
           <w:rPr>
@@ -3360,6 +3474,9 @@
       </w:hyperlink>
     </w:p>
     <w:p>
+      <w:pPr>
+        <w:spacing w:before="240" w:after="120"/>
+      </w:pPr>
       <w:hyperlink w:anchor="_Toc1359965655">
         <w:r>
           <w:rPr>
@@ -3393,6 +3510,7 @@
     </w:p>
     <w:p>
       <w:pPr>
+        <w:spacing w:before="120"/>
         <w:ind w:left="240"/>
       </w:pPr>
       <w:hyperlink w:anchor="_Toc1958162433">
@@ -3428,6 +3546,7 @@
     </w:p>
     <w:p>
       <w:pPr>
+        <w:spacing w:before="120"/>
         <w:ind w:left="240"/>
       </w:pPr>
       <w:hyperlink w:anchor="_Toc415190676">
@@ -3463,6 +3582,7 @@
     </w:p>
     <w:p>
       <w:pPr>
+        <w:spacing w:before="120"/>
         <w:ind w:left="240"/>
       </w:pPr>
       <w:hyperlink w:anchor="_Toc1093260318">
@@ -3498,6 +3618,7 @@
     </w:p>
     <w:p>
       <w:pPr>
+        <w:spacing w:before="120"/>
         <w:ind w:left="240"/>
       </w:pPr>
       <w:hyperlink w:anchor="_Toc1471533984">
@@ -3536,6 +3657,7 @@
     <w:p>
       <w:pPr>
         <w:pStyle w:val="Heading1"/>
+        <w:spacing w:before="480"/>
         <w:jc w:val="center"/>
       </w:pPr>
       <w:bookmarkStart w:id="25" w:name="_Toc484565143"/>
@@ -3647,6 +3769,7 @@
     <w:p>
       <w:pPr>
         <w:pStyle w:val="Heading1"/>
+        <w:spacing w:before="480"/>
         <w:jc w:val="center"/>
       </w:pPr>
       <w:bookmarkStart w:id="27" w:name="_Toc1359965655"/>
@@ -3670,6 +3793,7 @@
     <w:p>
       <w:pPr>
         <w:pStyle w:val="Heading2"/>
+        <w:spacing w:before="200"/>
       </w:pPr>
       <w:bookmarkStart w:id="29" w:name="_Toc1958162433"/>
       <w:bookmarkStart w:id="30" w:name="bulleted_list"/>
@@ -3713,6 +3837,7 @@
     <w:p>
       <w:pPr>
         <w:pStyle w:val="Heading2"/>
+        <w:spacing w:before="200"/>
       </w:pPr>
       <w:bookmarkStart w:id="31" w:name="_Toc415190676"/>
       <w:bookmarkStart w:id="32" w:name="numbered_list"/>
@@ -3756,6 +3881,7 @@
     <w:p>
       <w:pPr>
         <w:pStyle w:val="Heading2"/>
+        <w:spacing w:before="200"/>
       </w:pPr>
       <w:bookmarkStart w:id="33" w:name="_Toc1093260318"/>
       <w:bookmarkStart w:id="34" w:name="multi_level_lists"/>
@@ -3933,6 +4059,7 @@
     <w:p>
       <w:pPr>
         <w:pStyle w:val="Heading2"/>
+        <w:spacing w:before="200"/>
       </w:pPr>
       <w:bookmarkStart w:id="35" w:name="_Toc1471533984"/>
       <w:bookmarkStart w:id="36" w:name="continued_lists"/>

</xml_diff>

<commit_message>
feat: list items keep their markers
ListMetadata.marker records an item's marker where the document shows
other than its number and a dot or a round bullet (a), 1.1.1., iv., the
square and circle bullets), read from Word numbering, ODF list styles,
HTML's ol type and list-style-type, and the markers a PDF prints. PDF,
text, RTF and LaTeX output print it, HTML output writes it as the item's
list-style-type, and DOCX and ODT output number their list levels to
match. A nested Word level counts afresh under each item of the level
above, as Word numbers it.
</commit_message>
<xml_diff>
--- a/test/generator/baseline/gen.docx.to.docx.docx
+++ b/test/generator/baseline/gen.docx.to.docx.docx
@@ -4389,6 +4389,258 @@
       </w:pPr>
     </w:lvl>
   </w:abstractNum>
+  <w:abstractNum w:abstractNumId="2">
+    <w:multiLevelType w:val="multilevel"/>
+    <w:lvl w:ilvl="0">
+      <w:start w:val="1"/>
+      <w:numFmt w:val="decimal"/>
+      <w:lvlText w:val="%1."/>
+      <w:lvlJc w:val="left"/>
+      <w:pPr>
+        <w:ind w:left="720" w:hanging="360"/>
+      </w:pPr>
+    </w:lvl>
+    <w:lvl w:ilvl="1">
+      <w:start w:val="1"/>
+      <w:numFmt w:val="decimal"/>
+      <w:lvlText w:val="%1.%2."/>
+      <w:lvlJc w:val="left"/>
+      <w:pPr>
+        <w:ind w:left="1440" w:hanging="360"/>
+      </w:pPr>
+    </w:lvl>
+    <w:lvl w:ilvl="2">
+      <w:start w:val="1"/>
+      <w:numFmt w:val="decimal"/>
+      <w:lvlText w:val="%1.%2.%3."/>
+      <w:lvlJc w:val="left"/>
+      <w:pPr>
+        <w:ind w:left="2160" w:hanging="360"/>
+      </w:pPr>
+    </w:lvl>
+    <w:lvl w:ilvl="3">
+      <w:start w:val="1"/>
+      <w:numFmt w:val="decimal"/>
+      <w:lvlText w:val="%4."/>
+      <w:lvlJc w:val="left"/>
+      <w:pPr>
+        <w:ind w:left="2880" w:hanging="360"/>
+      </w:pPr>
+    </w:lvl>
+    <w:lvl w:ilvl="4">
+      <w:start w:val="1"/>
+      <w:numFmt w:val="decimal"/>
+      <w:lvlText w:val="%5."/>
+      <w:lvlJc w:val="left"/>
+      <w:pPr>
+        <w:ind w:left="3600" w:hanging="360"/>
+      </w:pPr>
+    </w:lvl>
+    <w:lvl w:ilvl="5">
+      <w:start w:val="1"/>
+      <w:numFmt w:val="decimal"/>
+      <w:lvlText w:val="%6."/>
+      <w:lvlJc w:val="left"/>
+      <w:pPr>
+        <w:ind w:left="4320" w:hanging="360"/>
+      </w:pPr>
+    </w:lvl>
+    <w:lvl w:ilvl="6">
+      <w:start w:val="1"/>
+      <w:numFmt w:val="decimal"/>
+      <w:lvlText w:val="%7."/>
+      <w:lvlJc w:val="left"/>
+      <w:pPr>
+        <w:ind w:left="5040" w:hanging="360"/>
+      </w:pPr>
+    </w:lvl>
+    <w:lvl w:ilvl="7">
+      <w:start w:val="1"/>
+      <w:numFmt w:val="decimal"/>
+      <w:lvlText w:val="%8."/>
+      <w:lvlJc w:val="left"/>
+      <w:pPr>
+        <w:ind w:left="5760" w:hanging="360"/>
+      </w:pPr>
+    </w:lvl>
+    <w:lvl w:ilvl="8">
+      <w:start w:val="1"/>
+      <w:numFmt w:val="decimal"/>
+      <w:lvlText w:val="%9."/>
+      <w:lvlJc w:val="left"/>
+      <w:pPr>
+        <w:ind w:left="6480" w:hanging="360"/>
+      </w:pPr>
+    </w:lvl>
+  </w:abstractNum>
+  <w:abstractNum w:abstractNumId="3">
+    <w:multiLevelType w:val="multilevel"/>
+    <w:lvl w:ilvl="0">
+      <w:start w:val="1"/>
+      <w:numFmt w:val="bullet"/>
+      <w:lvlText w:val="▪"/>
+      <w:lvlJc w:val="left"/>
+      <w:pPr>
+        <w:ind w:left="720" w:hanging="360"/>
+      </w:pPr>
+    </w:lvl>
+    <w:lvl w:ilvl="1">
+      <w:start w:val="1"/>
+      <w:numFmt w:val="bullet"/>
+      <w:lvlText w:val="•"/>
+      <w:lvlJc w:val="left"/>
+      <w:pPr>
+        <w:ind w:left="1440" w:hanging="360"/>
+      </w:pPr>
+    </w:lvl>
+    <w:lvl w:ilvl="2">
+      <w:start w:val="1"/>
+      <w:numFmt w:val="bullet"/>
+      <w:lvlText w:val="•"/>
+      <w:lvlJc w:val="left"/>
+      <w:pPr>
+        <w:ind w:left="2160" w:hanging="360"/>
+      </w:pPr>
+    </w:lvl>
+    <w:lvl w:ilvl="3">
+      <w:start w:val="1"/>
+      <w:numFmt w:val="bullet"/>
+      <w:lvlText w:val="◦"/>
+      <w:lvlJc w:val="left"/>
+      <w:pPr>
+        <w:ind w:left="2880" w:hanging="360"/>
+      </w:pPr>
+    </w:lvl>
+    <w:lvl w:ilvl="4">
+      <w:start w:val="1"/>
+      <w:numFmt w:val="bullet"/>
+      <w:lvlText w:val="▪"/>
+      <w:lvlJc w:val="left"/>
+      <w:pPr>
+        <w:ind w:left="3600" w:hanging="360"/>
+      </w:pPr>
+    </w:lvl>
+    <w:lvl w:ilvl="5">
+      <w:start w:val="1"/>
+      <w:numFmt w:val="bullet"/>
+      <w:lvlText w:val="▪"/>
+      <w:lvlJc w:val="left"/>
+      <w:pPr>
+        <w:ind w:left="4320" w:hanging="360"/>
+      </w:pPr>
+    </w:lvl>
+    <w:lvl w:ilvl="6">
+      <w:start w:val="1"/>
+      <w:numFmt w:val="bullet"/>
+      <w:lvlText w:val="▪"/>
+      <w:lvlJc w:val="left"/>
+      <w:pPr>
+        <w:ind w:left="5040" w:hanging="360"/>
+      </w:pPr>
+    </w:lvl>
+    <w:lvl w:ilvl="7">
+      <w:start w:val="1"/>
+      <w:numFmt w:val="bullet"/>
+      <w:lvlText w:val="▪"/>
+      <w:lvlJc w:val="left"/>
+      <w:pPr>
+        <w:ind w:left="5760" w:hanging="360"/>
+      </w:pPr>
+    </w:lvl>
+    <w:lvl w:ilvl="8">
+      <w:start w:val="1"/>
+      <w:numFmt w:val="bullet"/>
+      <w:lvlText w:val="▪"/>
+      <w:lvlJc w:val="left"/>
+      <w:pPr>
+        <w:ind w:left="6480" w:hanging="360"/>
+      </w:pPr>
+    </w:lvl>
+  </w:abstractNum>
+  <w:abstractNum w:abstractNumId="4">
+    <w:multiLevelType w:val="multilevel"/>
+    <w:lvl w:ilvl="0">
+      <w:start w:val="1"/>
+      <w:numFmt w:val="lowerRoman"/>
+      <w:lvlText w:val="%1."/>
+      <w:lvlJc w:val="left"/>
+      <w:pPr>
+        <w:ind w:left="720" w:hanging="360"/>
+      </w:pPr>
+    </w:lvl>
+    <w:lvl w:ilvl="1">
+      <w:start w:val="1"/>
+      <w:numFmt w:val="lowerRoman"/>
+      <w:lvlText w:val="%2."/>
+      <w:lvlJc w:val="left"/>
+      <w:pPr>
+        <w:ind w:left="1440" w:hanging="360"/>
+      </w:pPr>
+    </w:lvl>
+    <w:lvl w:ilvl="2">
+      <w:start w:val="1"/>
+      <w:numFmt w:val="lowerRoman"/>
+      <w:lvlText w:val="%3."/>
+      <w:lvlJc w:val="left"/>
+      <w:pPr>
+        <w:ind w:left="2160" w:hanging="360"/>
+      </w:pPr>
+    </w:lvl>
+    <w:lvl w:ilvl="3">
+      <w:start w:val="1"/>
+      <w:numFmt w:val="lowerRoman"/>
+      <w:lvlText w:val="%4."/>
+      <w:lvlJc w:val="left"/>
+      <w:pPr>
+        <w:ind w:left="2880" w:hanging="360"/>
+      </w:pPr>
+    </w:lvl>
+    <w:lvl w:ilvl="4">
+      <w:start w:val="1"/>
+      <w:numFmt w:val="lowerRoman"/>
+      <w:lvlText w:val="%5."/>
+      <w:lvlJc w:val="left"/>
+      <w:pPr>
+        <w:ind w:left="3600" w:hanging="360"/>
+      </w:pPr>
+    </w:lvl>
+    <w:lvl w:ilvl="5">
+      <w:start w:val="1"/>
+      <w:numFmt w:val="lowerRoman"/>
+      <w:lvlText w:val="%6."/>
+      <w:lvlJc w:val="left"/>
+      <w:pPr>
+        <w:ind w:left="4320" w:hanging="360"/>
+      </w:pPr>
+    </w:lvl>
+    <w:lvl w:ilvl="6">
+      <w:start w:val="1"/>
+      <w:numFmt w:val="lowerRoman"/>
+      <w:lvlText w:val="%7."/>
+      <w:lvlJc w:val="left"/>
+      <w:pPr>
+        <w:ind w:left="5040" w:hanging="360"/>
+      </w:pPr>
+    </w:lvl>
+    <w:lvl w:ilvl="7">
+      <w:start w:val="1"/>
+      <w:numFmt w:val="lowerRoman"/>
+      <w:lvlText w:val="%8."/>
+      <w:lvlJc w:val="left"/>
+      <w:pPr>
+        <w:ind w:left="5760" w:hanging="360"/>
+      </w:pPr>
+    </w:lvl>
+    <w:lvl w:ilvl="8">
+      <w:start w:val="1"/>
+      <w:numFmt w:val="lowerRoman"/>
+      <w:lvlText w:val="%9."/>
+      <w:lvlJc w:val="left"/>
+      <w:pPr>
+        <w:ind w:left="6480" w:hanging="360"/>
+      </w:pPr>
+    </w:lvl>
+  </w:abstractNum>
   <w:num w:numId="1">
     <w:abstractNumId w:val="0"/>
   </w:num>
@@ -4399,7 +4651,7 @@
     </w:lvlOverride>
   </w:num>
   <w:num w:numId="3">
-    <w:abstractNumId w:val="1"/>
+    <w:abstractNumId w:val="2"/>
     <w:lvlOverride w:ilvl="0">
       <w:startOverride w:val="1"/>
     </w:lvlOverride>
@@ -4411,10 +4663,10 @@
     </w:lvlOverride>
   </w:num>
   <w:num w:numId="4">
-    <w:abstractNumId w:val="0"/>
+    <w:abstractNumId w:val="3"/>
   </w:num>
   <w:num w:numId="5">
-    <w:abstractNumId w:val="1"/>
+    <w:abstractNumId w:val="4"/>
     <w:lvlOverride w:ilvl="0">
       <w:startOverride w:val="1"/>
     </w:lvlOverride>

</xml_diff>

<commit_message>
feat: page sizes, sections, and headers and footers on every page
The AST carries the document's page (OfficeMetadata.pageSetup: size and
margins in points) and, on the page break that starts each later section,
that section's (BreakMetadata.section and pageSetup), read from Word's
sections and a PDF's pages. Word headers and footers are one node per
part, with their kind (default, first, even), their section, and hidden
where Word does not show them; PAGE and NUMPAGES results are marked
(TextMetadata.field).

Paper format 'auto', now the default for PDF, DOCX, ODT and LaTeX output,
lays pages out as the document has them (else A4): the native PDF engine
gives each section its size and margins, and draws each page's header and
footer, its section's or the one carried on, with page numbers filled in.
Every page printed A4 portrait, with every header at the top of the
document and every footer at its end.
</commit_message>
<xml_diff>
--- a/test/generator/baseline/gen.docx.to.docx.docx
+++ b/test/generator/baseline/gen.docx.to.docx.docx
@@ -416,8 +416,8 @@
         </w:tblBorders>
       </w:tblPr>
       <w:tblGrid>
-        <w:gridCol w:w="4513"/>
-        <w:gridCol w:w="4513"/>
+        <w:gridCol w:w="4680"/>
+        <w:gridCol w:w="4680"/>
       </w:tblGrid>
       <w:tr>
         <w:tc>
@@ -588,12 +588,12 @@
         </w:tblBorders>
       </w:tblPr>
       <w:tblGrid>
-        <w:gridCol w:w="1504"/>
-        <w:gridCol w:w="1504"/>
-        <w:gridCol w:w="1504"/>
-        <w:gridCol w:w="1504"/>
-        <w:gridCol w:w="1504"/>
-        <w:gridCol w:w="1504"/>
+        <w:gridCol w:w="1560"/>
+        <w:gridCol w:w="1560"/>
+        <w:gridCol w:w="1560"/>
+        <w:gridCol w:w="1560"/>
+        <w:gridCol w:w="1560"/>
+        <w:gridCol w:w="1560"/>
       </w:tblGrid>
       <w:tr>
         <w:tc>
@@ -1075,10 +1075,10 @@
         </w:tblBorders>
       </w:tblPr>
       <w:tblGrid>
-        <w:gridCol w:w="2256"/>
-        <w:gridCol w:w="2256"/>
-        <w:gridCol w:w="2256"/>
-        <w:gridCol w:w="2256"/>
+        <w:gridCol w:w="2340"/>
+        <w:gridCol w:w="2340"/>
+        <w:gridCol w:w="2340"/>
+        <w:gridCol w:w="2340"/>
       </w:tblGrid>
       <w:tr>
         <w:tc>
@@ -1535,8 +1535,8 @@
         </w:tblBorders>
       </w:tblPr>
       <w:tblGrid>
-        <w:gridCol w:w="4513"/>
-        <w:gridCol w:w="4513"/>
+        <w:gridCol w:w="4680"/>
+        <w:gridCol w:w="4680"/>
       </w:tblGrid>
       <w:tr>
         <w:tc>
@@ -1557,8 +1557,8 @@
               </w:tblBorders>
             </w:tblPr>
             <w:tblGrid>
-              <w:gridCol w:w="4513"/>
-              <w:gridCol w:w="4513"/>
+              <w:gridCol w:w="4680"/>
+              <w:gridCol w:w="4680"/>
             </w:tblGrid>
             <w:tr>
               <w:tc>
@@ -1686,20 +1686,20 @@
         </w:tblBorders>
       </w:tblPr>
       <w:tblGrid>
-        <w:gridCol w:w="644"/>
-        <w:gridCol w:w="644"/>
-        <w:gridCol w:w="644"/>
-        <w:gridCol w:w="644"/>
-        <w:gridCol w:w="644"/>
-        <w:gridCol w:w="644"/>
-        <w:gridCol w:w="644"/>
-        <w:gridCol w:w="644"/>
-        <w:gridCol w:w="644"/>
-        <w:gridCol w:w="644"/>
-        <w:gridCol w:w="644"/>
-        <w:gridCol w:w="644"/>
-        <w:gridCol w:w="644"/>
-        <w:gridCol w:w="644"/>
+        <w:gridCol w:w="668"/>
+        <w:gridCol w:w="668"/>
+        <w:gridCol w:w="668"/>
+        <w:gridCol w:w="668"/>
+        <w:gridCol w:w="668"/>
+        <w:gridCol w:w="668"/>
+        <w:gridCol w:w="668"/>
+        <w:gridCol w:w="668"/>
+        <w:gridCol w:w="668"/>
+        <w:gridCol w:w="668"/>
+        <w:gridCol w:w="668"/>
+        <w:gridCol w:w="668"/>
+        <w:gridCol w:w="668"/>
+        <w:gridCol w:w="668"/>
       </w:tblGrid>
       <w:tr>
         <w:tc>
@@ -3688,7 +3688,7 @@
       <w:r>
         <w:drawing>
           <wp:inline distT="0" distB="0" distL="0" distR="0">
-            <wp:extent cx="5731510" cy="5731510"/>
+            <wp:extent cx="5943600" cy="5943600"/>
             <wp:docPr id="1" name="image1" descr="165 Inspirational Quotes To Keep You Motivated In Life"/>
             <a:graphic xmlns:a="http://schemas.openxmlformats.org/drawingml/2006/main">
               <a:graphicData uri="http://schemas.openxmlformats.org/drawingml/2006/picture">
@@ -3706,7 +3706,7 @@
                   <pic:spPr>
                     <a:xfrm>
                       <a:off x="0" y="0"/>
-                      <a:ext cx="5731510" cy="5731510"/>
+                      <a:ext cx="5943600" cy="5943600"/>
                     </a:xfrm>
                     <a:prstGeom prst="rect">
                       <a:avLst/>
@@ -4136,7 +4136,7 @@
       </w:r>
     </w:p>
     <w:sectPr>
-      <w:pgSz w:w="11906" w:h="16838"/>
+      <w:pgSz w:w="12240" w:h="15840"/>
       <w:pgMar w:top="1440" w:right="1440" w:bottom="1440" w:left="1440" w:header="708" w:footer="708" w:gutter="0"/>
     </w:sectPr>
   </w:body>

</xml_diff>